<commit_message>
Tema 2-3: betigi olan grafik ve uzay dolgu gorselleri baski boyutunda yeniden cizildi; C5H10 kartlari iki sutuna alindi
</commit_message>
<xml_diff>
--- a/Kim12-2-10-Fonksiyonel-Gruplu-Bilesiklerin-Adlandirilmasi.docx
+++ b/Kim12-2-10-Fonksiyonel-Gruplu-Bilesiklerin-Adlandirilmasi.docx
@@ -11327,7 +11327,7 @@
       <w:r>
         <w:drawing>
           <wp:inline distT="0" distB="0" distL="0" distR="0">
-            <wp:extent cx="5400000" cy="1542857"/>
+            <wp:extent cx="5544000" cy="1582693"/>
             <wp:docPr id="900004" name="Grafik 900004" descr="Birincil, ikincil ve üçüncül alkol modelleri"/>
             <wp:cNvGraphicFramePr>
               <a:graphicFrameLocks noChangeAspect="1"/>
@@ -11348,7 +11348,7 @@
                   <pic:spPr>
                     <a:xfrm>
                       <a:off x="0" y="0"/>
-                      <a:ext cx="5400000" cy="1542857"/>
+                      <a:ext cx="5544000" cy="1582693"/>
                     </a:xfrm>
                     <a:prstGeom prst="rect">
                       <a:avLst/>

</xml_diff>

<commit_message>
Kim12-2-10-Fonksiyonel-Gruplu-Bilesiklerin-Adlandirilmasi: gorsel alanlarina Shutter onizlemeleri yerlestirildi (2.3 bicimi)
</commit_message>
<xml_diff>
--- a/Kim12-2-10-Fonksiyonel-Gruplu-Bilesiklerin-Adlandirilmasi.docx
+++ b/Kim12-2-10-Fonksiyonel-Gruplu-Bilesiklerin-Adlandirilmasi.docx
@@ -39,99 +39,73 @@
         <w:t xml:space="preserve">Bir el kreminin ya da cam temizleyicisinin arkasındaki içerik listesine baktığınızda “propan-2-ol”, “propan-1,2,3-triol”, “etil etanoat” gibi adlarla karşılaşabilirsiniz (Görsel A). Bir eczacı, kimyager ya da gıda mühendisi bu adları okuduğunda bileşiğin yapısını kâğıda çizebilir. Aynı şekilde laboratuvarda yeni sentezlenen bir maddenin yapısı bilindiğinde dünyanın her yerinde aynı biçimde anlaşılacak tek bir ad verilebilir (Görsel B). Peki bu adlar hangi kurallara göre oluşturulur? Bir bileşiğin adındaki her parça molekülün hangi kısmını anlatır? Alkanları adlandırırken kullandığınız kurallar fonksiyonel grup taşıyan bileşiklere nasıl uygulanabilir? Bu soruların cevabını bir etkinlik yaparak keşfediniz. Analiz ve Keşif Atölyesi 2.10.’da tümdengelimsel akıl yürüteceksiniz: Alkol, eter, aldehit, keton, karboksilik asit ve esterlerin yapı formüllerini adlarıyla birlikte inceleyecek; her bileşikte fonksiyonel grubu, ana zinciri ve yan grupları belirleyecek; molekülün parçaları ile adın parçaları arasında ilişki kuracak ve ulaştığınız genel kuralları yeni bileşiklere uygulayacaksınız. Alkolleri sınıflandırırken adım adım ve sistematik çalışacak, fonksiyonel grup önceliğini belirlerken grubunuzla iş birliği yapacaksınız. Farklı bakış açılarına saygı göstererek etkili iletişim kuracak, grup çalışmalarında uyumlu ve yapıcı davranacaksınız.</w:t>
       </w:r>
     </w:p>
-    <w:tbl>
-      <w:tblPr>
-        <w:tblW w:w="9000" w:type="dxa"/>
+    <w:p>
+      <w:pPr>
         <w:jc w:val="center"/>
-        <w:tblBorders>
-          <w:top w:val="single" w:sz="8" w:space="0" w:color="7F7F7F"/>
-          <w:left w:val="single" w:sz="8" w:space="0" w:color="7F7F7F"/>
-          <w:bottom w:val="single" w:sz="8" w:space="0" w:color="7F7F7F"/>
-          <w:right w:val="single" w:sz="8" w:space="0" w:color="7F7F7F"/>
-        </w:tblBorders>
-      </w:tblPr>
-      <w:tblGrid>
-        <w:gridCol w:w="9000"/>
-      </w:tblGrid>
-      <w:tr>
-        <w:tc>
-          <w:tcPr>
-            <w:tcW w:w="9000" w:type="dxa"/>
-            <w:shd w:val="clear" w:color="auto" w:fill="EDEDED"/>
-          </w:tcPr>
-          <w:p>
-            <w:pPr>
-              <w:jc w:val="both"/>
-              <w:rPr>
-                <w:rFonts w:ascii="Times New Roman" w:hAnsi="Times New Roman" w:cs="Times New Roman"/>
-                <w:lang w:val="tr-TR"/>
-              </w:rPr>
-            </w:pPr>
-            <w:r>
-              <w:rPr>
-                <w:rFonts w:ascii="Times New Roman" w:hAnsi="Times New Roman" w:cs="Times New Roman"/>
-                <w:lang w:val="tr-TR"/>
-              </w:rPr>
-              <w:t xml:space="preserve">GÖRSEL ALANI (Shutterstock)</w:t>
-            </w:r>
-          </w:p>
-          <w:p>
-            <w:pPr>
-              <w:jc w:val="both"/>
-              <w:rPr>
-                <w:rFonts w:ascii="Times New Roman" w:hAnsi="Times New Roman" w:cs="Times New Roman"/>
-                <w:lang w:val="tr-TR"/>
-              </w:rPr>
-            </w:pPr>
-            <w:r>
-              <w:rPr>
-                <w:rFonts w:ascii="Times New Roman" w:hAnsi="Times New Roman" w:cs="Times New Roman"/>
-                <w:lang w:val="tr-TR"/>
-              </w:rPr>
-              <w:t xml:space="preserve">Tarif: Bir kozmetik ya da temizlik ürünü ambalajının arka yüzündeki içerik listesinin yakın çekimi; kimyasal adlar okunabilir, marka ve logo görünmesin.</w:t>
-            </w:r>
-          </w:p>
-          <w:p>
-            <w:pPr>
-              <w:jc w:val="both"/>
-              <w:rPr>
-                <w:rFonts w:ascii="Times New Roman" w:hAnsi="Times New Roman" w:cs="Times New Roman"/>
-                <w:lang w:val="tr-TR"/>
-              </w:rPr>
-            </w:pPr>
-            <w:r>
-              <w:rPr>
-                <w:rFonts w:ascii="Times New Roman" w:hAnsi="Times New Roman" w:cs="Times New Roman"/>
-                <w:lang w:val="tr-TR"/>
-              </w:rPr>
-              <w:t xml:space="preserve">Shutter ID: 2728797423 (fotoğraf) — Woman reading the label of a cosmetic tube in a shop</w:t>
-            </w:r>
-          </w:p>
-        </w:tc>
-      </w:tr>
-    </w:tbl>
-    <w:p>
-      <w:pPr>
-        <w:jc w:val="both"/>
-        <w:rPr>
-          <w:rFonts w:ascii="Times New Roman" w:hAnsi="Times New Roman" w:cs="Times New Roman"/>
-          <w:lang w:val="tr-TR"/>
-        </w:rPr>
-      </w:pPr>
+      </w:pPr>
+      <w:r>
+        <w:drawing>
+          <wp:inline xmlns:a="http://schemas.openxmlformats.org/drawingml/2006/main" xmlns:pic="http://schemas.openxmlformats.org/drawingml/2006/picture">
+            <wp:extent cx="4004237" cy="2520000"/>
+            <wp:docPr id="900011" name="Picture 900011"/>
+            <wp:cNvGraphicFramePr>
+              <a:graphicFrameLocks noChangeAspect="1"/>
+            </wp:cNvGraphicFramePr>
+            <a:graphic>
+              <a:graphicData uri="http://schemas.openxmlformats.org/drawingml/2006/picture">
+                <pic:pic>
+                  <pic:nvPicPr>
+                    <pic:cNvPr id="0" name="2728797423_d.jpg"/>
+                    <pic:cNvPicPr/>
+                  </pic:nvPicPr>
+                  <pic:blipFill>
+                    <a:blip r:embed="rId11"/>
+                    <a:stretch>
+                      <a:fillRect/>
+                    </a:stretch>
+                  </pic:blipFill>
+                  <pic:spPr>
+                    <a:xfrm>
+                      <a:off x="0" y="0"/>
+                      <a:ext cx="4004237" cy="2520000"/>
+                    </a:xfrm>
+                    <a:prstGeom prst="rect"/>
+                  </pic:spPr>
+                </pic:pic>
+              </a:graphicData>
+            </a:graphic>
+          </wp:inline>
+        </w:drawing>
+      </w:r>
     </w:p>
     <w:p>
       <w:pPr>
         <w:jc w:val="center"/>
-        <w:rPr>
-          <w:rFonts w:ascii="Times New Roman" w:hAnsi="Times New Roman" w:cs="Times New Roman"/>
-          <w:lang w:val="tr-TR"/>
-        </w:rPr>
       </w:pPr>
       <w:r>
         <w:rPr>
           <w:rFonts w:ascii="Times New Roman" w:hAnsi="Times New Roman" w:cs="Times New Roman"/>
           <w:b/>
           <w:bCs/>
+          <w:highlight w:val="yellow"/>
+          <w:lang w:val="tr-TR"/>
+        </w:rPr>
+        <w:t xml:space="preserve">Shutter id: 2728797423</w:t>
+      </w:r>
+    </w:p>
+    <w:p>
+      <w:pPr>
+        <w:jc w:val="center"/>
+        <w:rPr>
+          <w:rFonts w:ascii="Times New Roman" w:hAnsi="Times New Roman" w:cs="Times New Roman"/>
+          <w:lang w:val="tr-TR"/>
+        </w:rPr>
+      </w:pPr>
+      <w:r>
+        <w:rPr>
+          <w:rFonts w:ascii="Times New Roman" w:hAnsi="Times New Roman" w:cs="Times New Roman"/>
+          <w:b/>
+          <w:bCs/>
           <w:lang w:val="tr-TR"/>
         </w:rPr>
         <w:t xml:space="preserve">Görsel A:</w:t>
@@ -144,85 +118,59 @@
         <w:t xml:space="preserve"> Bir ürünün içerik listesi</w:t>
       </w:r>
     </w:p>
-    <w:tbl>
-      <w:tblPr>
-        <w:tblW w:w="9000" w:type="dxa"/>
+    <w:p>
+      <w:pPr>
         <w:jc w:val="center"/>
-        <w:tblBorders>
-          <w:top w:val="single" w:sz="8" w:space="0" w:color="7F7F7F"/>
-          <w:left w:val="single" w:sz="8" w:space="0" w:color="7F7F7F"/>
-          <w:bottom w:val="single" w:sz="8" w:space="0" w:color="7F7F7F"/>
-          <w:right w:val="single" w:sz="8" w:space="0" w:color="7F7F7F"/>
-        </w:tblBorders>
-      </w:tblPr>
-      <w:tblGrid>
-        <w:gridCol w:w="9000"/>
-      </w:tblGrid>
-      <w:tr>
-        <w:tc>
-          <w:tcPr>
-            <w:tcW w:w="9000" w:type="dxa"/>
-            <w:shd w:val="clear" w:color="auto" w:fill="EDEDED"/>
-          </w:tcPr>
-          <w:p>
-            <w:pPr>
-              <w:jc w:val="both"/>
-              <w:rPr>
-                <w:rFonts w:ascii="Times New Roman" w:hAnsi="Times New Roman" w:cs="Times New Roman"/>
-                <w:lang w:val="tr-TR"/>
-              </w:rPr>
-            </w:pPr>
-            <w:r>
-              <w:rPr>
-                <w:rFonts w:ascii="Times New Roman" w:hAnsi="Times New Roman" w:cs="Times New Roman"/>
-                <w:lang w:val="tr-TR"/>
-              </w:rPr>
-              <w:t xml:space="preserve">GÖRSEL ALANI (Shutterstock)</w:t>
-            </w:r>
-          </w:p>
-          <w:p>
-            <w:pPr>
-              <w:jc w:val="both"/>
-              <w:rPr>
-                <w:rFonts w:ascii="Times New Roman" w:hAnsi="Times New Roman" w:cs="Times New Roman"/>
-                <w:lang w:val="tr-TR"/>
-              </w:rPr>
-            </w:pPr>
-            <w:r>
-              <w:rPr>
-                <w:rFonts w:ascii="Times New Roman" w:hAnsi="Times New Roman" w:cs="Times New Roman"/>
-                <w:lang w:val="tr-TR"/>
-              </w:rPr>
-              <w:t xml:space="preserve">Tarif: Laboratuvarda tahtaya ya da cam panoya organik molekül yapı formülleri çizen genç bir kimyager.</w:t>
-            </w:r>
-          </w:p>
-          <w:p>
-            <w:pPr>
-              <w:jc w:val="both"/>
-              <w:rPr>
-                <w:rFonts w:ascii="Times New Roman" w:hAnsi="Times New Roman" w:cs="Times New Roman"/>
-                <w:lang w:val="tr-TR"/>
-              </w:rPr>
-            </w:pPr>
-            <w:r>
-              <w:rPr>
-                <w:rFonts w:ascii="Times New Roman" w:hAnsi="Times New Roman" w:cs="Times New Roman"/>
-                <w:lang w:val="tr-TR"/>
-              </w:rPr>
-              <w:t xml:space="preserve">Shutter ID: 2398564391 (fotoğraf) — Female scientist writing a chemical formula</w:t>
-            </w:r>
-          </w:p>
-        </w:tc>
-      </w:tr>
-    </w:tbl>
+      </w:pPr>
+      <w:r>
+        <w:drawing>
+          <wp:inline xmlns:a="http://schemas.openxmlformats.org/drawingml/2006/main" xmlns:pic="http://schemas.openxmlformats.org/drawingml/2006/picture">
+            <wp:extent cx="2362500" cy="2520000"/>
+            <wp:docPr id="900012" name="Picture 900012"/>
+            <wp:cNvGraphicFramePr>
+              <a:graphicFrameLocks noChangeAspect="1"/>
+            </wp:cNvGraphicFramePr>
+            <a:graphic>
+              <a:graphicData uri="http://schemas.openxmlformats.org/drawingml/2006/picture">
+                <pic:pic>
+                  <pic:nvPicPr>
+                    <pic:cNvPr id="0" name="2398564391_d.jpg"/>
+                    <pic:cNvPicPr/>
+                  </pic:nvPicPr>
+                  <pic:blipFill>
+                    <a:blip r:embed="rId12"/>
+                    <a:stretch>
+                      <a:fillRect/>
+                    </a:stretch>
+                  </pic:blipFill>
+                  <pic:spPr>
+                    <a:xfrm>
+                      <a:off x="0" y="0"/>
+                      <a:ext cx="2362500" cy="2520000"/>
+                    </a:xfrm>
+                    <a:prstGeom prst="rect"/>
+                  </pic:spPr>
+                </pic:pic>
+              </a:graphicData>
+            </a:graphic>
+          </wp:inline>
+        </w:drawing>
+      </w:r>
+    </w:p>
     <w:p>
       <w:pPr>
-        <w:jc w:val="both"/>
-        <w:rPr>
-          <w:rFonts w:ascii="Times New Roman" w:hAnsi="Times New Roman" w:cs="Times New Roman"/>
-          <w:lang w:val="tr-TR"/>
-        </w:rPr>
-      </w:pPr>
+        <w:jc w:val="center"/>
+      </w:pPr>
+      <w:r>
+        <w:rPr>
+          <w:rFonts w:ascii="Times New Roman" w:hAnsi="Times New Roman" w:cs="Times New Roman"/>
+          <w:b/>
+          <w:bCs/>
+          <w:highlight w:val="yellow"/>
+          <w:lang w:val="tr-TR"/>
+        </w:rPr>
+        <w:t xml:space="preserve">Shutter id: 2398564391</w:t>
+      </w:r>
     </w:p>
     <w:p>
       <w:pPr>

</xml_diff>